<commit_message>
docs: actualizar arquitectura técnica a tres capas
</commit_message>
<xml_diff>
--- a/ARQUITECTURA/ARQUITECTURA TECNICA/AFRISAN_06_ARQUITECTURA_TECNICA.docx
+++ b/ARQUITECTURA/ARQUITECTURA TECNICA/AFRISAN_06_ARQUITECTURA_TECNICA.docx
@@ -347,7 +347,7 @@
         <w:rPr>
           <w:rtl w:val="0"/>
         </w:rPr>
-        <w:t xml:space="preserve">El siguiente diagrama muestra los componentes de software del sistema, agrupados en capa cliente, capa de aplicación (backend) y capa de datos/servicios externos, junto con sus interacciones principales.</w:t>
+        <w:t>El siguiente diagrama muestra los componentes de software del sistema, organizados según una arquitectura cliente-servidor de tres capas lógicas: capa de presentación, capa de lógica de negocio y capa de persistencia/datos, junto con sus interacciones principales.</w:t>
       </w:r>
     </w:p>
     <w:p>
@@ -1132,7 +1132,7 @@
         <w:rPr>
           <w:rtl w:val="0"/>
         </w:rPr>
-        <w:t xml:space="preserve">A continuación se identifican los endpoints REST principales definidos para soportar los requisitos funcionales del ERS. La API utiliza versionado mediante el prefijo /api/v1 y se implementa sobre ASP.NET Core Web API (.NET 8).</w:t>
+        <w:t>A continuación se identifican los endpoints REST previstos para satisfacer los requisitos del ERS. El diseño objetivo contempla versionado mediante el prefijo /api/v1 y ASP.NET Core Web API (.NET 8). Esta tabla es una especificación futura: la API implementada durante el desarrollo local utiliza rutas /api/...; no se declara que todas las rutas /api/v1/... estén disponibles actualmente.</w:t>
       </w:r>
     </w:p>
     <w:tbl>
@@ -4338,7 +4338,7 @@
         <w:rPr>
           <w:rtl w:val="0"/>
         </w:rPr>
-        <w:t xml:space="preserve">Todas las rutas, salvo /api/v1/auth/login, requerirán un token de autenticación (JWT) en el encabezado de la solicitud, y las comunicaciones se realizarán exclusivamente sobre HTTPS/TLS, conforme al requisito RNF-02 del ERS.</w:t>
+        <w:t>Como requisito de diseño objetivo, las rutas protegidas deberán exigir autenticación mediante JWT y autorización según el rol, y el despliegue deberá usar HTTPS/TLS. La implementación local actual todavía no cuenta con todos esos controles; no debe interpretarse esta especificación como una validación de seguridad realizada.</w:t>
       </w:r>
     </w:p>
     <w:p>
@@ -4629,7 +4629,7 @@
           <w:vertAlign w:val="baseline"/>
           <w:rtl w:val="0"/>
         </w:rPr>
-        <w:t xml:space="preserve">Frontend móvil: .NET MAUI (.NET 8), con patrón MVVM, Camera.MAUI / ZXing.Net.MAUI para cámara y lectura QR, y SQLite para funcionamiento offline.</w:t>
+        <w:t>Frontend móvil previsto: .NET MAUI (.NET 8), con patrón MVVM aplicado únicamente a la interfaz del cliente móvil, Camera.MAUI / ZXing.Net.MAUI para cámara y lectura QR, y SQLite para funcionamiento offline.</w:t>
       </w:r>
       <w:r>
         <w:rPr>
@@ -4690,7 +4690,7 @@
           <w:vertAlign w:val="baseline"/>
           <w:rtl w:val="0"/>
         </w:rPr>
-        <w:t xml:space="preserve">Frontend web/escritorio: Blazor WebAssembly (.NET 8), consumiendo la API REST mediante HTTPS/JSON.</w:t>
+        <w:t>Frontend web/escritorio: Blazor WebAssembly (.NET 8), consumidor de la API REST. El diseño de despliegue contempla HTTPS/JSON; el entorno local de desarrollo puede operar con una configuración distinta y deberá verificarse antes de producción.</w:t>
       </w:r>
       <w:r>
         <w:rPr>
@@ -4751,7 +4751,7 @@
           <w:vertAlign w:val="baseline"/>
           <w:rtl w:val="0"/>
         </w:rPr>
-        <w:t xml:space="preserve">Backend/API REST: ASP.NET Core Web API (.NET 8) con Entity Framework Core 8 para acceso a datos y reglas de negocio.</w:t>
+        <w:t>Backend/API REST: ASP.NET Core Web API (.NET 8) con Entity Framework Core 8. Corresponde a la capa de lógica de negocio y centraliza validaciones, reglas de inventario, trazabilidad, auditoría y acceso controlado a los datos.</w:t>
       </w:r>
       <w:r>
         <w:rPr>
@@ -4812,7 +4812,7 @@
           <w:vertAlign w:val="baseline"/>
           <w:rtl w:val="0"/>
         </w:rPr>
-        <w:t xml:space="preserve">Autenticación: JSON Web Tokens (JWT) mediante ASP.NET Core Authentication, con control de acceso por roles y cifrado seguro de credenciales.</w:t>
+        <w:t>Autenticación prevista: JSON Web Tokens (JWT) mediante ASP.NET Core Authentication, con autorización por roles y almacenamiento seguro de credenciales. Su desarrollo y verificación permanecen pendientes.</w:t>
       </w:r>
       <w:r>
         <w:rPr>
@@ -5979,36 +5979,24 @@
             <w:vAlign w:val="center"/>
           </w:tcPr>
           <w:p>
-            <w:pPr>
-              <w:rPr/>
-            </w:pPr>
-            <w:r>
-              <w:rPr>
-                <w:rtl w:val="0"/>
-              </w:rPr>
-              <w:t xml:space="preserve">Arquitectura de software 4+1</w:t>
-            </w:r>
-          </w:p>
-        </w:tc>
-        <w:tc>
-          <w:tcPr>
-            <w:tcBorders>
-              <w:top w:color="000000" w:space="0" w:sz="4" w:val="single"/>
-              <w:left w:color="000000" w:space="0" w:sz="4" w:val="single"/>
-              <w:bottom w:color="000000" w:space="0" w:sz="4" w:val="single"/>
-              <w:right w:color="000000" w:space="0" w:sz="4" w:val="single"/>
-            </w:tcBorders>
-            <w:vAlign w:val="center"/>
-          </w:tcPr>
-          <w:p>
-            <w:pPr>
-              <w:rPr/>
-            </w:pPr>
-            <w:r>
-              <w:rPr>
-                <w:rtl w:val="0"/>
-              </w:rPr>
-              <w:t xml:space="preserve">Arquitectura técnica y diagramas</w:t>
+            <w:r>
+              <w:t>Arquitectura de software 4+1 basada en tres capas</w:t>
+            </w:r>
+          </w:p>
+        </w:tc>
+        <w:tc>
+          <w:tcPr>
+            <w:tcBorders>
+              <w:top w:color="000000" w:space="0" w:sz="4" w:val="single"/>
+              <w:left w:color="000000" w:space="0" w:sz="4" w:val="single"/>
+              <w:bottom w:color="000000" w:space="0" w:sz="4" w:val="single"/>
+              <w:right w:color="000000" w:space="0" w:sz="4" w:val="single"/>
+            </w:tcBorders>
+            <w:vAlign w:val="center"/>
+          </w:tcPr>
+          <w:p>
+            <w:r>
+              <w:t>Arquitectura técnica de tres capas y diagramas</w:t>
             </w:r>
           </w:p>
         </w:tc>
@@ -7264,7 +7252,7 @@
         <w:rPr>
           <w:rtl w:val="0"/>
         </w:rPr>
-        <w:t xml:space="preserve">Las tecnologías seleccionadas —.NET MAUI, Blazor WebAssembly, ASP.NET Core Web API, Entity Framework Core, PostgreSQL/Supabase, SQLite, Azure App Service y Power BI— son tecnologías maduras, documentadas y compatibles entre sí. El uso predominante del ecosistema .NET reduce la complejidad de integración y el riesgo tecnológico.</w:t>
+        <w:t>Las tecnologías seleccionadas —.NET MAUI, Blazor WebAssembly, ASP.NET Core Web API, Entity Framework Core, PostgreSQL/Supabase, SQLite, Azure App Service y Power BI— son tecnologías maduras, documentadas y compatibles entre sí. La arquitectura global se organiza como cliente-servidor de tres capas lógicas, lo que reduce la ambigüedad entre presentación, lógica de negocio y persistencia, y facilita la integración progresiva entre componentes.</w:t>
       </w:r>
     </w:p>
     <w:p>

</xml_diff>